<commit_message>
Fix unicode encoding issues, add key findings and dataset Google Drive link to README, update report
</commit_message>
<xml_diff>
--- a/report/project_report.docx
+++ b/report/project_report.docx
@@ -383,7 +383,7 @@
           </w:tcPr>
           <w:p>
             <w:r>
-              <w:t>Dataset source link: To be added.</w:t>
+              <w:t>Dataset source link: https://drive.google.com/file/d/1xx3co8Mo7EDAGTvhiVA8CkgJ_vOmPfsI/view?usp=sharing</w:t>
             </w:r>
           </w:p>
         </w:tc>
@@ -3350,7 +3350,7 @@
     </w:p>
     <w:p>
       <w:r>
-        <w:t>Dataset source link: To be added.</w:t>
+        <w:t>Dataset source link: https://drive.google.com/file/d/1xx3co8Mo7EDAGTvhiVA8CkgJ_vOmPfsI/view?usp=sharing</w:t>
       </w:r>
     </w:p>
     <w:p>

</xml_diff>

<commit_message>
Final formatting corrections, fix dashboard errors, and verify project
</commit_message>
<xml_diff>
--- a/report/project_report.docx
+++ b/report/project_report.docx
@@ -383,8 +383,17 @@
           </w:tcPr>
           <w:p>
             <w:r>
-              <w:t>Dataset source link: https://drive.google.com/file/d/1xx3co8Mo7EDAGTvhiVA8CkgJ_vOmPfsI/view?usp=sharing</w:t>
+              <w:t xml:space="preserve">Dataset source link: </w:t>
             </w:r>
+            <w:hyperlink r:id="rId17">
+              <w:r>
+                <w:rPr>
+                  <w:color w:val="0563C1"/>
+                  <w:u w:val="single"/>
+                </w:rPr>
+                <w:t>https://drive.google.com/file/d/1xx3co8Mo7EDAGTvhiVA8CkgJ_vOmPfsI/view?usp=sharing</w:t>
+              </w:r>
+            </w:hyperlink>
           </w:p>
         </w:tc>
       </w:tr>
@@ -2259,7 +2268,7 @@
         <w:pStyle w:val="ListBullet"/>
       </w:pPr>
       <w:r>
-        <w:t>At Risk (&gt;10 days): 2,247 orders (13.2%)</w:t>
+        <w:t>At-Risk (&gt;10 days): 2,247 orders (13.2%)</w:t>
       </w:r>
     </w:p>
     <w:p>
@@ -2290,7 +2299,7 @@
     </w:p>
     <w:p>
       <w:r>
-        <w:t>38.0% of orders include a discount. Discounted orders have an average order value of ₹1,178.13 compared to ₹1,338.28 for non-discounted orders (difference: ₹-160.15). This suggests discounts are applied to higher-value orders, either as a volume incentive or through selective promotional targeting.</w:t>
+        <w:t>38.0% of orders include a discount. Discounted orders have an average order value of ₹1,178.13 compared to ₹1,338.28 for non-discounted orders (difference: -₹160.15). Discounted AOV (₹1,178.13) is lower than non-discounted AOV (₹1,338.28). This indicates that orders with discounts have a lower average order value, consistent with the formula where discounts reduce the total amount.</w:t>
       </w:r>
     </w:p>
     <w:p>
@@ -2538,7 +2547,7 @@
           </w:tcPr>
           <w:p>
             <w:r>
-              <w:t>Discounted AOV (₹1,178) is higher than non-discounted AOV (₹1,338).</w:t>
+              <w:t>Discounted AOV (₹1,178.13) is lower than non-discounted AOV (₹1,338.28).</w:t>
             </w:r>
           </w:p>
         </w:tc>
@@ -2975,7 +2984,7 @@
         <w:pStyle w:val="ListBullet"/>
       </w:pPr>
       <w:r>
-        <w:t>38.0% of orders include a discount; discounted orders have a higher AOV (₹1,178.13) than non-discounted orders (₹1,338.28).</w:t>
+        <w:t>38.0% of orders include a discount; discounted AOV (₹1,178.13) is lower than non-discounted AOV (₹1,338.28).</w:t>
       </w:r>
     </w:p>
     <w:p>
@@ -3350,8 +3359,17 @@
     </w:p>
     <w:p>
       <w:r>
-        <w:t>Dataset source link: https://drive.google.com/file/d/1xx3co8Mo7EDAGTvhiVA8CkgJ_vOmPfsI/view?usp=sharing</w:t>
+        <w:t xml:space="preserve">Dataset source link: </w:t>
       </w:r>
+      <w:hyperlink r:id="rId17">
+        <w:r>
+          <w:rPr>
+            <w:color w:val="0563C1"/>
+            <w:u w:val="single"/>
+          </w:rPr>
+          <w:t>https://drive.google.com/file/d/1xx3co8Mo7EDAGTvhiVA8CkgJ_vOmPfsI/view?usp=sharing</w:t>
+        </w:r>
+      </w:hyperlink>
     </w:p>
     <w:p>
       <w:r>

</xml_diff>